<commit_message>
docs(audit): mark C1 contact form fixed, note orders/dealers/consultations untested
Co-Authored-By: Claude Sonnet 5 <noreply@anthropic.com>
</commit_message>
<xml_diff>
--- a/audit-claude.docx
+++ b/audit-claude.docx
@@ -93,7 +93,7 @@
         <w:rPr>
           <w:b/>
         </w:rPr>
-        <w:t xml:space="preserve">Toàn bộ lead/đơn hàng biến mất sau khi submit.</w:t>
+        <w:t xml:space="preserve">[✅ ĐÃ FIX HOÀN TOÀN] Toàn bộ lead/đơn hàng biến mất sau khi submit.</w:t>
       </w:r>
       <w:r>
         <w:t xml:space="preserve"> Form liên hệ, đăng ký đại lý, tư vấn và đơn hàng đều ghi thật vào Prisma/Postgres, nhưng không có email thông báo (không có nơi nào </w:t>
@@ -115,6 +115,90 @@
       </w:r>
       <w:r>
         <w:t xml:space="preserve">) và không có admin UI nào để xem (các bảng này không phải Payload collection). Nhân viên chỉ có thể thấy dữ liệu bằng cách truy vấn DB thủ công — nghĩa là hiện tại mọi lead/đơn hàng thực tế đang bị bỏ lỡ.</w:t>
+      </w:r>
+      <w:r>
+        <w:t xml:space="preserve"> </w:t>
+      </w:r>
+      <w:r>
+        <w:rPr>
+          <w:b/>
+        </w:rPr>
+        <w:t xml:space="preserve">Cập nhật 2026-09-21:</w:t>
+      </w:r>
+      <w:r>
+        <w:t xml:space="preserve"> đã tạo 5 bảng Prisma còn thiếu qua Neon SQL Editor (không qua </w:t>
+      </w:r>
+      <w:r>
+        <w:rPr>
+          <w:rStyle w:val="CodeChar"/>
+        </w:rPr>
+        <w:t xml:space="preserve">prisma migrate deploy</w:t>
+      </w:r>
+      <w:r>
+        <w:t xml:space="preserve"> do sandbox không đủ Node version) và verify bằng 1 request POST thật lên production: Form liên hệ (</w:t>
+      </w:r>
+      <w:r>
+        <w:rPr>
+          <w:rStyle w:val="CodeChar"/>
+        </w:rPr>
+        <w:t xml:space="preserve">/api/contact</w:t>
+      </w:r>
+      <w:r>
+        <w:t xml:space="preserve">) ghi thành công vào </w:t>
+      </w:r>
+      <w:r>
+        <w:rPr>
+          <w:rStyle w:val="CodeChar"/>
+        </w:rPr>
+        <w:t xml:space="preserve">contact_messages</w:t>
+      </w:r>
+      <w:r>
+        <w:t xml:space="preserve"> (id </w:t>
+      </w:r>
+      <w:r>
+        <w:rPr>
+          <w:rStyle w:val="CodeChar"/>
+        </w:rPr>
+        <w:t xml:space="preserve">cmub6xuqa000004l69efcfxiy</w:t>
+      </w:r>
+      <w:r>
+        <w:t xml:space="preserve">, đã xóa sau test). </w:t>
+      </w:r>
+      <w:r>
+        <w:rPr>
+          <w:rStyle w:val="CodeChar"/>
+        </w:rPr>
+        <w:t xml:space="preserve">/api/orders</w:t>
+      </w:r>
+      <w:r>
+        <w:t xml:space="preserve">, </w:t>
+      </w:r>
+      <w:r>
+        <w:rPr>
+          <w:rStyle w:val="CodeChar"/>
+        </w:rPr>
+        <w:t xml:space="preserve">/api/dealers</w:t>
+      </w:r>
+      <w:r>
+        <w:t xml:space="preserve">, </w:t>
+      </w:r>
+      <w:r>
+        <w:rPr>
+          <w:rStyle w:val="CodeChar"/>
+        </w:rPr>
+        <w:t xml:space="preserve">/api/consultations</w:t>
+      </w:r>
+      <w:r>
+        <w:t xml:space="preserve"> dùng chung 5 bảng này nên khả năng cao đã fix theo, nhưng </w:t>
+      </w:r>
+      <w:r>
+        <w:rPr>
+          <w:b/>
+        </w:rPr>
+        <w:t xml:space="preserve">chưa test riêng từng route</w:t>
+      </w:r>
+      <w:r>
+        <w:t xml:space="preserve"> — xem chi tiết ở bảng đối chiếu CMS ↔ Frontend bên dưới.</w:t>
       </w:r>
     </w:p>
     <w:p>
@@ -893,7 +977,34 @@
           <w:p>
             <w:pPr/>
             <w:r>
-              <w:t xml:space="preserve">❌ Functionally broken — tin nhắn biến mất sau khi gửi</w:t>
+              <w:t xml:space="preserve">✅ Đã fix hoàn toàn — verify bằng 1 request POST thật lên production (id </w:t>
+            </w:r>
+            <w:r>
+              <w:rPr>
+                <w:rStyle w:val="CodeChar"/>
+              </w:rPr>
+              <w:t xml:space="preserve">cmub6xuqa000004l69efcfxiy</w:t>
+            </w:r>
+            <w:r>
+              <w:t xml:space="preserve">, đã xóa), xác nhận ghi thành công vào </w:t>
+            </w:r>
+            <w:r>
+              <w:rPr>
+                <w:rStyle w:val="CodeChar"/>
+              </w:rPr>
+              <w:t xml:space="preserve">contact_messages</w:t>
+            </w:r>
+            <w:r>
+              <w:t xml:space="preserve"> sau khi tạo bảng qua Neon SQL Editor (không qua </w:t>
+            </w:r>
+            <w:r>
+              <w:rPr>
+                <w:rStyle w:val="CodeChar"/>
+              </w:rPr>
+              <w:t xml:space="preserve">prisma migrate deploy</w:t>
+            </w:r>
+            <w:r>
+              <w:t xml:space="preserve"> do sandbox không đủ Node version)</w:t>
             </w:r>
           </w:p>
         </w:tc>
@@ -968,7 +1079,28 @@
           <w:p>
             <w:pPr/>
             <w:r>
-              <w:t xml:space="preserve">❌ Payment method giả; ❌ không có UI quản lý đơn hàng</w:t>
+              <w:t xml:space="preserve">❌ Payment method giả (chưa fix, ngoài phạm vi lần này); </w:t>
+            </w:r>
+            <w:r>
+              <w:t xml:space="preserve">✅ có khả năng đã fix việc thiếu UI quản lý đơn hàng — dùng chung 5 bảng vừa tạo qua Neon SQL Editor (xem row Form liên hệ) + admin dashboard </w:t>
+            </w:r>
+            <w:r>
+              <w:rPr>
+                <w:rStyle w:val="CodeChar"/>
+              </w:rPr>
+              <w:t xml:space="preserve">/quan-ly</w:t>
+            </w:r>
+            <w:r>
+              <w:t xml:space="preserve"> mới, nhưng CHƯA test riêng </w:t>
+            </w:r>
+            <w:r>
+              <w:rPr>
+                <w:rStyle w:val="CodeChar"/>
+              </w:rPr>
+              <w:t xml:space="preserve">/api/orders</w:t>
+            </w:r>
+            <w:r>
+              <w:t xml:space="preserve"> bằng request thật</w:t>
             </w:r>
           </w:p>
         </w:tc>
@@ -1025,7 +1157,34 @@
           <w:p>
             <w:pPr/>
             <w:r>
-              <w:t xml:space="preserve">❌ Không có admin visibility</w:t>
+              <w:t xml:space="preserve">✅ có khả năng đã fix, cần test riêng — dùng chung 5 bảng vừa tạo qua Neon SQL Editor + admin dashboard </w:t>
+            </w:r>
+            <w:r>
+              <w:rPr>
+                <w:rStyle w:val="CodeChar"/>
+              </w:rPr>
+              <w:t xml:space="preserve">/quan-ly</w:t>
+            </w:r>
+            <w:r>
+              <w:t xml:space="preserve"> mới, nhưng CHƯA test riêng </w:t>
+            </w:r>
+            <w:r>
+              <w:rPr>
+                <w:rStyle w:val="CodeChar"/>
+              </w:rPr>
+              <w:t xml:space="preserve">/api/dealers</w:t>
+            </w:r>
+            <w:r>
+              <w:t xml:space="preserve"> và </w:t>
+            </w:r>
+            <w:r>
+              <w:rPr>
+                <w:rStyle w:val="CodeChar"/>
+              </w:rPr>
+              <w:t xml:space="preserve">/api/consultations</w:t>
+            </w:r>
+            <w:r>
+              <w:t xml:space="preserve"> bằng request thật</w:t>
             </w:r>
           </w:p>
         </w:tc>

</xml_diff>